<commit_message>
Add support-zero sensitivity and arXiv-ready preprint
</commit_message>
<xml_diff>
--- a/paper/preprint.docx
+++ b/paper/preprint.docx
@@ -18,7 +18,7 @@
         <w:rPr>
           <w:b/>
         </w:rPr>
-        <w:t>Yicheng “Billy” Lu1; Xinyi Lu2</w:t>
+        <w:t>Yicheng "Billy" Lu1; Xinyi Lu2</w:t>
       </w:r>
     </w:p>
     <w:p>
@@ -26,7 +26,7 @@
         <w:jc w:val="center"/>
       </w:pPr>
       <w:r>
-        <w:t>1 Computer Engineering student, University of California, Santa Barbara</w:t>
+        <w:t>1 University of California, Santa Barbara, Santa Barbara, CA, USA</w:t>
       </w:r>
     </w:p>
     <w:p>
@@ -34,7 +34,7 @@
         <w:jc w:val="center"/>
       </w:pPr>
       <w:r>
-        <w:t>2 Student, Lynbrook High School</w:t>
+        <w:t>2 Lynbrook High School, San Jose, CA, USA</w:t>
       </w:r>
     </w:p>
     <w:p>
@@ -347,6 +347,11 @@
       </w:r>
     </w:p>
     <w:p>
+      <w:r>
+        <w:t>For the within-context annotation-recovery analysis, an eligible context-label cell was defined as a non-nucleus cell with at least 10 positive and at least 10 negative held-out rows. Five cells met this rule. The threshold was applied before averaging AP across cells.</w:t>
+      </w:r>
+    </w:p>
+    <w:p>
       <w:pPr>
         <w:pStyle w:val="NHSJSSubsection"/>
         <w:keepNext/>
@@ -372,7 +377,12 @@
     </w:p>
     <w:p>
       <w:r>
-        <w:t>We calculated record fraction and Wilson 95% intervals for support values 0–15. For each context, we reported prevalence, AP, AP minus prevalence, normalized AP lift, AUROC, and Brier score. Calibration was summarized in ten equal-frequency test bins. Sequence sensitivity compared composition plus length (6 features), 3-mers only (64 features), and the complete representation (70 features). These are deliberately simple sequence views and do not test every possible sequence model.</w:t>
+        <w:t>We calculated record fraction and Wilson 95% intervals for support values 0-15. For each context, we reported prevalence, AP, AP minus prevalence, normalized AP lift, AUROC, and Brier score. Calibration was summarized in ten equal-frequency test bins. Sequence sensitivity compared composition plus length (6 features), 3-mers only (64 features), and the complete representation (70 features). These are deliberately simple sequence views and do not test every possible sequence model.</w:t>
+      </w:r>
+    </w:p>
+    <w:p>
+      <w:r>
+        <w:t>Because support zero is a deterministic cohort-selection boundary, we specified a reviewer-requested post hoc sensitivity analysis before running it. Every pair with support zero was excluded from training, validation, and testing. Context, support, context-plus-support, and the full context-plus-support-plus-sequence model were then retuned and refit using the original split, model family, regularization grid, and 1,000 component-bootstrap replicates.</w:t>
       </w:r>
     </w:p>
     <w:p>
@@ -386,7 +396,7 @@
     </w:p>
     <w:p>
       <w:r>
-        <w:t>The study used previously published molecular database records and involved no direct interaction with human participants, identifiable clinical information, or new animal experiments. Formal institutional requirements must be confirmed by the submitting authors. Analysis scripts, tests, frozen analysis plan, figure source tables, software versions, and file hashes are included in the project package. Redistribution of source-derived RNALocate records must be checked against the database terms before a public release.</w:t>
+        <w:t>The study used previously published molecular database records and involved no direct interaction with human participants, identifiable clinical information, or new animal experiments. Analysis scripts, tests, the frozen analysis plan and sensitivity amendment, figure source tables, software versions, and file hashes are included in the project package. Redistribution of source-derived RNALocate records must follow the database terms.</w:t>
       </w:r>
     </w:p>
     <w:p>
@@ -1094,7 +1104,21 @@
     <w:p/>
     <w:p>
       <w:r>
-        <w:t>Paired component bootstraps clarified the incremental information (Figure 2B). Adding sequence after context increased AP by 0.0787 (95% CI 0.0719–0.0863), whereas adding support after context increased AP by 0.1535 (0.1458–0.1616). Once context and support were included, adding sequence changed AP by only 0.00087 (0.00072–0.00105). Conversely, support still added 0.0757 (0.0695–0.0823) after context and sequence.</w:t>
+        <w:t>Paired component bootstraps clarified the incremental information (Figure 2B). Adding sequence after context increased AP by 0.0787 (95% CI 0.0719-0.0863), whereas adding support after context increased AP by 0.1535 (0.1458-0.1616). Once context and support were included, adding sequence changed AP by only 0.00087 (0.00072-0.00105). Conversely, support still added 0.0757 (0.0695-0.0823) after context and sequence.</w:t>
+      </w:r>
+    </w:p>
+    <w:p>
+      <w:pPr>
+        <w:pStyle w:val="NHSJSSubsection"/>
+        <w:keepNext/>
+      </w:pPr>
+      <w:r>
+        <w:t>Excluding the support-zero boundary did not change the conclusion</w:t>
+      </w:r>
+    </w:p>
+    <w:p>
+      <w:r>
+        <w:t>The support-zero exclusion removed 992 of 300,048 pairs across all splits, including 149 test pairs. The reduced test set contained 45,003 pairs with prevalence 0.6866. Context AP was 0.8014 (95% CI 0.7923-0.8115), support AP was 0.9006 (0.8959-0.9051), context-plus-support AP was 0.9573 (0.9544-0.9601), and full-model AP was 0.9582 (0.9552-0.9610). Context plus support remained 0.1559 AP above context (0.1475-0.1641), whereas sequence added 0.00086 after context plus support (0.00069-0.00104). Thus, the structural result did not depend on the deterministic support-zero pairs. This post hoc sensitivity addresses that boundary but not other forms of database selection.</w:t>
       </w:r>
     </w:p>
     <w:p>
@@ -1248,7 +1272,7 @@
     </w:p>
     <w:p>
       <w:r>
-        <w:t>Within a fixed context, a context-only model cannot rank genes. Across five eligible non-nucleus context-label cells, mean within-context AP was 0.4523 for the context baseline, 0.5281 for 3-mers, and 0.5352 for context plus 3-mers (Figure 4C). This shows that the tested sequence features retained modest ranking information even though context dominated the global average. Context dominance was stable across the primary sequence graph and three MMseqs2 clustering stress tests (Figure 4D).</w:t>
+        <w:t>Within a fixed context, a context-only model cannot rank genes. Across the five non-nucleus context-label cells with at least 10 positive and 10 negative held-out rows, mean within-context AP was 0.4523 for the context baseline, 0.5281 for 3-mers, and 0.5352 for context plus 3-mers (Figure 4C). This shows that the tested sequence features retained modest ranking information even though context dominated the global average. Context dominance was stable across the primary sequence graph and three MMseqs2 clustering stress tests (Figure 4D).</w:t>
       </w:r>
     </w:p>
     <w:p>
@@ -1299,7 +1323,7 @@
         <w:rPr>
           <w:sz w:val="18"/>
         </w:rPr>
-        <w:t>Figure 4 | Database structure has a clear consequence for localization annotation recovery. (A) Macro AP for recovering four recorded localization labels among already observed gene-context rows. (B) Per-label AP. (C) Mean AP across five eligible non-nucleus context-label cells. (D) Context and low-level-sequence macro AP under the primary sequence graph and three clustering stress tests. These analyses concern database annotations and do not validate localization for unrecorded pairs.</w:t>
+        <w:t>Figure 4 | Database structure has a clear consequence for localization annotation recovery. (A) Macro AP for recovering four recorded localization labels among already observed gene-context rows. (B) Per-label AP. (C) Mean AP across the five non-nucleus context-label cells with at least 10 positive and 10 negative held-out rows. (D) Context and low-level-sequence macro AP under the primary sequence graph and three clustering stress tests. These analyses concern database annotations and do not validate localization for unrecorded pairs.</w:t>
       </w:r>
     </w:p>
     <w:p>
@@ -1374,7 +1398,7 @@
     </w:p>
     <w:p>
       <w:r>
-        <w:t>The panel was selected after retaining genes and contexts with sufficient records, so its prevalence is not the prevalence of all human mRNA localization. Support zero is structurally constrained by gene eligibility. The selected representative transcript may not match the localized isoform. The primary split controls detected sequence links at one identity and coverage threshold but cannot rule out every distant relationship. Logistic regression and three low-level sequence views do not represent all possible RNA models; a richer representation could discover additional biological signal. Context-specific estimates came from one selected database panel, and the poorest context showed that the shortcut is not equally strong everywhere. Bootstrap intervals condition on the fixed dataset, preprocessing, model family, and split. Finally, no experiment here identifies the causal origin of the observed coverage structure.</w:t>
+        <w:t>The panel was selected after retaining genes and contexts with sufficient records, so its prevalence is not the prevalence of all human mRNA localization. Support zero is structurally constrained by gene eligibility; excluding it in a post hoc sensitivity analysis did not materially change the results. The selected representative transcript may not match the localized isoform. The primary split controls detected sequence links at one identity and coverage threshold but cannot rule out every distant relationship. Logistic regression and three low-level sequence views do not represent all possible RNA models; a richer representation could discover additional biological signal. Context-specific estimates came from one selected database panel, and the poorest context showed that the shortcut is not equally strong everywhere. Bootstrap intervals condition on the fixed dataset, preprocessing, model family, and split. Finally, no experiment here identifies the causal origin of the observed coverage structure.</w:t>
       </w:r>
     </w:p>
     <w:p>
@@ -1421,7 +1445,7 @@
     </w:p>
     <w:p>
       <w:r>
-        <w:t>Code, analysis scripts, paper-facing source tables, figures, and the concise high-school manuscript are available at https://github.com/billylu24/Auditing-Whether-Models-Learn-RNA-Sequence-or-Database-Structure-in-RNALocate. RNALocate v3.0 is available from its official database.</w:t>
+        <w:t>Code, analysis scripts, aggregate results, paper-facing source tables, and figures are available at https://github.com/billylu24/Auditing-Whether-Models-Learn-RNA-Sequence-or-Database-Structure-in-RNALocate. RNALocate v3.0 is available from its official database.</w:t>
       </w:r>
     </w:p>
     <w:p>

</xml_diff>